<commit_message>
ajout des graphiques dans les doc word
</commit_message>
<xml_diff>
--- a/Rapports_mensuels/2025_11/ipc_note_08_ang_2025_11.docx
+++ b/Rapports_mensuels/2025_11/ipc_note_08_ang_2025_11.docx
@@ -128,7 +128,70 @@
         <w:pStyle w:val="ipccorps"/>
       </w:pPr>
       <w:r>
-        <w:t xml:space="preserve">Reading: In November 2025, the consumer price index increased by 1.4% compared to November 2024</w:t>
+        <w:t xml:space="preserve">Reading: In November 2025, the consumer price index increased by 0.6% compared to November 2024</w:t>
+      </w:r>
+    </w:p>
+    <w:p>
+      <w:pPr>
+        <w:pStyle w:val="ipctitre0"/>
+      </w:pPr>
+      <w:r>
+        <w:t xml:space="preserve">6- Annual evolution (%) of the consumer price index for the month of November</w:t>
+      </w:r>
+    </w:p>
+    <w:p>
+      <w:pPr>
+        <w:pStyle w:val="BodyText"/>
+      </w:pPr>
+      <w:r>
+        <w:drawing>
+          <wp:inline>
+            <wp:extent cx="5544151" cy="3696101"/>
+            <wp:effectExtent b="0" l="0" r="0" t="0"/>
+            <wp:docPr descr="" title="" id="24" name="Picture"/>
+            <a:graphic>
+              <a:graphicData uri="http://schemas.openxmlformats.org/drawingml/2006/picture">
+                <pic:pic>
+                  <pic:nvPicPr>
+                    <pic:cNvPr descr="ipc_note_ang_quarto_files/figure-docx/unnamed-chunk-3-1.png" id="25" name="Picture"/>
+                    <pic:cNvPicPr>
+                      <a:picLocks noChangeArrowheads="1" noChangeAspect="1"/>
+                    </pic:cNvPicPr>
+                  </pic:nvPicPr>
+                  <pic:blipFill>
+                    <a:blip r:embed="rId23"/>
+                    <a:stretch>
+                      <a:fillRect/>
+                    </a:stretch>
+                  </pic:blipFill>
+                  <pic:spPr bwMode="auto">
+                    <a:xfrm>
+                      <a:off x="0" y="0"/>
+                      <a:ext cx="5544151" cy="3696101"/>
+                    </a:xfrm>
+                    <a:prstGeom prst="rect">
+                      <a:avLst/>
+                    </a:prstGeom>
+                    <a:noFill/>
+                    <a:ln w="9525">
+                      <a:noFill/>
+                      <a:headEnd/>
+                      <a:tailEnd/>
+                    </a:ln>
+                  </pic:spPr>
+                </pic:pic>
+              </a:graphicData>
+            </a:graphic>
+          </wp:inline>
+        </w:drawing>
+      </w:r>
+    </w:p>
+    <w:p>
+      <w:pPr>
+        <w:pStyle w:val="ipccorps"/>
+      </w:pPr>
+      <w:r>
+        <w:t xml:space="preserve">Reading: In November 2025, the consumer price index decreased by -0.3% compared to October 2025</w:t>
       </w:r>
     </w:p>
     <w:sectPr>

</xml_diff>